<commit_message>
docs: add completed project documents, incident report and verification screenshots
</commit_message>
<xml_diff>
--- a/Project4_Incident_Report-1.docx
+++ b/Project4_Incident_Report-1.docx
@@ -56,7 +56,25 @@
           <w:sz w:val="24"/>
           <w:szCs w:val="24"/>
         </w:rPr>
-        <w:t>Prepared by: Okpoyo Victory Etim | Matric No.: CLC/2026/TC-7/0122</w:t>
+        <w:t xml:space="preserve">Prepared by: Okpoyo Victory </w:t>
+      </w:r>
+      <w:proofErr w:type="spellStart"/>
+      <w:r>
+        <w:rPr>
+          <w:iCs/>
+          <w:sz w:val="24"/>
+          <w:szCs w:val="24"/>
+        </w:rPr>
+        <w:t>Etim</w:t>
+      </w:r>
+      <w:proofErr w:type="spellEnd"/>
+      <w:r>
+        <w:rPr>
+          <w:iCs/>
+          <w:sz w:val="24"/>
+          <w:szCs w:val="24"/>
+        </w:rPr>
+        <w:t xml:space="preserve"> | Matric No.: CLC/2026/TC-7/0122</w:t>
       </w:r>
     </w:p>
     <w:p>
@@ -136,7 +154,15 @@
         <w:t>"AADSTS7000215: Invalid client secret provided"</w:t>
       </w:r>
       <w:r>
-        <w:t xml:space="preserve">, and intermittent MissingSubscription errors identical to those encountered earlier during local terminal execution. </w:t>
+        <w:t xml:space="preserve">, and intermittent </w:t>
+      </w:r>
+      <w:proofErr w:type="spellStart"/>
+      <w:r>
+        <w:t>MissingSubscription</w:t>
+      </w:r>
+      <w:proofErr w:type="spellEnd"/>
+      <w:r>
+        <w:t xml:space="preserve"> errors identical to those encountered earlier during local terminal execution. </w:t>
       </w:r>
     </w:p>
     <w:p>
@@ -226,7 +252,55 @@
           <w:sz w:val="24"/>
           <w:szCs w:val="24"/>
         </w:rPr>
-        <w:t xml:space="preserve"> ERROR: (AuthorizationFailed) The client with object id '92736737...' does not have authorization to perform action 'Microsoft.Authorization/roleAssignments/write'.</w:t>
+        <w:t xml:space="preserve"> ERROR: (</w:t>
+      </w:r>
+      <w:proofErr w:type="spellStart"/>
+      <w:r>
+        <w:rPr>
+          <w:sz w:val="24"/>
+          <w:szCs w:val="24"/>
+        </w:rPr>
+        <w:t>AuthorizationFailed</w:t>
+      </w:r>
+      <w:proofErr w:type="spellEnd"/>
+      <w:r>
+        <w:rPr>
+          <w:sz w:val="24"/>
+          <w:szCs w:val="24"/>
+        </w:rPr>
+        <w:t>) The client with object id '92736737...' does not have authorization to perform action '</w:t>
+      </w:r>
+      <w:proofErr w:type="spellStart"/>
+      <w:r>
+        <w:rPr>
+          <w:sz w:val="24"/>
+          <w:szCs w:val="24"/>
+        </w:rPr>
+        <w:t>Microsoft.Authorization</w:t>
+      </w:r>
+      <w:proofErr w:type="spellEnd"/>
+      <w:r>
+        <w:rPr>
+          <w:sz w:val="24"/>
+          <w:szCs w:val="24"/>
+        </w:rPr>
+        <w:t>/</w:t>
+      </w:r>
+      <w:proofErr w:type="spellStart"/>
+      <w:r>
+        <w:rPr>
+          <w:sz w:val="24"/>
+          <w:szCs w:val="24"/>
+        </w:rPr>
+        <w:t>roleAssignments</w:t>
+      </w:r>
+      <w:proofErr w:type="spellEnd"/>
+      <w:r>
+        <w:rPr>
+          <w:sz w:val="24"/>
+          <w:szCs w:val="24"/>
+        </w:rPr>
+        <w:t>/write'.</w:t>
       </w:r>
     </w:p>
     <w:p>
@@ -384,6 +458,7 @@
         </w:rPr>
         <w:t>​</w:t>
       </w:r>
+      <w:proofErr w:type="spellStart"/>
       <w:r>
         <w:rPr>
           <w:b/>
@@ -391,14 +466,56 @@
           <w:sz w:val="24"/>
           <w:szCs w:val="24"/>
         </w:rPr>
-        <w:t>Git CLI Installation &amp; Secret Resolution:</w:t>
-      </w:r>
-      <w:r>
-        <w:rPr>
-          <w:sz w:val="24"/>
-          <w:szCs w:val="24"/>
-        </w:rPr>
-        <w:t xml:space="preserve"> Installed the Git CLI tool in the environment, which properly aligned the local git/shell tooling and environment path </w:t>
+        <w:t>Git</w:t>
+      </w:r>
+      <w:proofErr w:type="spellEnd"/>
+      <w:r>
+        <w:rPr>
+          <w:b/>
+          <w:bCs/>
+          <w:sz w:val="24"/>
+          <w:szCs w:val="24"/>
+        </w:rPr>
+        <w:t xml:space="preserve"> CLI Installation &amp; Secret Resolution:</w:t>
+      </w:r>
+      <w:r>
+        <w:rPr>
+          <w:sz w:val="24"/>
+          <w:szCs w:val="24"/>
+        </w:rPr>
+        <w:t xml:space="preserve"> Installed the </w:t>
+      </w:r>
+      <w:proofErr w:type="spellStart"/>
+      <w:r>
+        <w:rPr>
+          <w:sz w:val="24"/>
+          <w:szCs w:val="24"/>
+        </w:rPr>
+        <w:t>Git</w:t>
+      </w:r>
+      <w:proofErr w:type="spellEnd"/>
+      <w:r>
+        <w:rPr>
+          <w:sz w:val="24"/>
+          <w:szCs w:val="24"/>
+        </w:rPr>
+        <w:t xml:space="preserve"> CLI tool in the environment, which properly aligned the local </w:t>
+      </w:r>
+      <w:proofErr w:type="spellStart"/>
+      <w:r>
+        <w:rPr>
+          <w:sz w:val="24"/>
+          <w:szCs w:val="24"/>
+        </w:rPr>
+        <w:t>git</w:t>
+      </w:r>
+      <w:proofErr w:type="spellEnd"/>
+      <w:r>
+        <w:rPr>
+          <w:sz w:val="24"/>
+          <w:szCs w:val="24"/>
+        </w:rPr>
+        <w:t xml:space="preserve">/shell tooling and environment path </w:t>
       </w:r>
       <w:r>
         <w:rPr>
@@ -442,7 +559,25 @@
           <w:sz w:val="24"/>
           <w:szCs w:val="24"/>
         </w:rPr>
-        <w:t xml:space="preserve"> Attempted to authenticate locally using az login --service-principal to isolate whether the fault was in the credential itself or in how GitHub was passing it. This surfaced a shell interpretation bug: pasting the secret value unquoted into a Bash command caused the shell to interpret a leading tilde (~) character as a home-directory reference, silently truncating the secret string before reaching Azure.</w:t>
+        <w:t xml:space="preserve"> Attempted to authenticate locally using </w:t>
+      </w:r>
+      <w:proofErr w:type="spellStart"/>
+      <w:proofErr w:type="gramStart"/>
+      <w:r>
+        <w:rPr>
+          <w:sz w:val="24"/>
+          <w:szCs w:val="24"/>
+        </w:rPr>
+        <w:t>az</w:t>
+      </w:r>
+      <w:proofErr w:type="spellEnd"/>
+      <w:proofErr w:type="gramEnd"/>
+      <w:r>
+        <w:rPr>
+          <w:sz w:val="24"/>
+          <w:szCs w:val="24"/>
+        </w:rPr>
+        <w:t xml:space="preserve"> login --service-principal to isolate whether the fault was in the credential itself or in how GitHub was passing it. This surfaced a shell interpretation bug: pasting the secret value unquoted into a Bash command caused the shell to interpret a leading tilde (~) character as a home-directory reference, silently truncating the secret string before reaching Azure.</w:t>
       </w:r>
     </w:p>
     <w:p>
@@ -494,7 +629,25 @@
           <w:sz w:val="24"/>
           <w:szCs w:val="24"/>
         </w:rPr>
-        <w:t xml:space="preserve"> Upon reaching the provisioning stage in CI/CD, the script crashed at lines 69–70 (az ad group member add) because test users (InternTestUser1 &amp; InternTestUser2) already existed in the Interns AD group from prior executions. Because line 3 enforced set -e, Azure's duplicate membership non-zero exit code immediately terminated the pipeline.</w:t>
+        <w:t xml:space="preserve"> Upon reaching the provisioning stage in CI/CD, the script crashed at lines 69–70 (</w:t>
+      </w:r>
+      <w:proofErr w:type="spellStart"/>
+      <w:proofErr w:type="gramStart"/>
+      <w:r>
+        <w:rPr>
+          <w:sz w:val="24"/>
+          <w:szCs w:val="24"/>
+        </w:rPr>
+        <w:t>az</w:t>
+      </w:r>
+      <w:proofErr w:type="spellEnd"/>
+      <w:proofErr w:type="gramEnd"/>
+      <w:r>
+        <w:rPr>
+          <w:sz w:val="24"/>
+          <w:szCs w:val="24"/>
+        </w:rPr>
+        <w:t xml:space="preserve"> ad group member add) because test users (InternTestUser1 &amp; InternTestUser2) already existed in the Interns AD group from prior executions. Because line 3 enforced set -e, Azure's duplicate membership non-zero exit code immediately terminated the pipeline.</w:t>
       </w:r>
     </w:p>
     <w:p>
@@ -530,7 +683,73 @@
           <w:sz w:val="24"/>
           <w:szCs w:val="24"/>
         </w:rPr>
-        <w:t xml:space="preserve"> After fixing script idempotency, the pipeline failed on role assignment commands (az role assignment create). Analysis of Azure Activity Logs revealed that while the Service Principal held Contributor rights (allowing resource provisioning), it lacked permission to write RBAC assignments (Microsoft.Authorization/roleAssignments/write), which requires User Access Administrator or Owner permissions.</w:t>
+        <w:t xml:space="preserve"> After fixing script </w:t>
+      </w:r>
+      <w:proofErr w:type="spellStart"/>
+      <w:r>
+        <w:rPr>
+          <w:sz w:val="24"/>
+          <w:szCs w:val="24"/>
+        </w:rPr>
+        <w:t>idempotency</w:t>
+      </w:r>
+      <w:proofErr w:type="spellEnd"/>
+      <w:r>
+        <w:rPr>
+          <w:sz w:val="24"/>
+          <w:szCs w:val="24"/>
+        </w:rPr>
+        <w:t>, the pipeline failed on role assignment commands (</w:t>
+      </w:r>
+      <w:proofErr w:type="spellStart"/>
+      <w:proofErr w:type="gramStart"/>
+      <w:r>
+        <w:rPr>
+          <w:sz w:val="24"/>
+          <w:szCs w:val="24"/>
+        </w:rPr>
+        <w:t>az</w:t>
+      </w:r>
+      <w:proofErr w:type="spellEnd"/>
+      <w:proofErr w:type="gramEnd"/>
+      <w:r>
+        <w:rPr>
+          <w:sz w:val="24"/>
+          <w:szCs w:val="24"/>
+        </w:rPr>
+        <w:t xml:space="preserve"> role assignment create). Analysis of Azure Activity Logs revealed that while the Service Principal held Contributor rights (allowing resource provisioning), it lacked permission to write RBAC assignments (</w:t>
+      </w:r>
+      <w:proofErr w:type="spellStart"/>
+      <w:r>
+        <w:rPr>
+          <w:sz w:val="24"/>
+          <w:szCs w:val="24"/>
+        </w:rPr>
+        <w:t>Microsoft.Authorization</w:t>
+      </w:r>
+      <w:proofErr w:type="spellEnd"/>
+      <w:r>
+        <w:rPr>
+          <w:sz w:val="24"/>
+          <w:szCs w:val="24"/>
+        </w:rPr>
+        <w:t>/</w:t>
+      </w:r>
+      <w:proofErr w:type="spellStart"/>
+      <w:r>
+        <w:rPr>
+          <w:sz w:val="24"/>
+          <w:szCs w:val="24"/>
+        </w:rPr>
+        <w:t>roleAssignments</w:t>
+      </w:r>
+      <w:proofErr w:type="spellEnd"/>
+      <w:r>
+        <w:rPr>
+          <w:sz w:val="24"/>
+          <w:szCs w:val="24"/>
+        </w:rPr>
+        <w:t>/write), which requires User Access Administrator or Owner permissions.</w:t>
       </w:r>
     </w:p>
     <w:p>
@@ -595,14 +814,50 @@
           <w:sz w:val="24"/>
           <w:szCs w:val="24"/>
         </w:rPr>
-        <w:t>Credential Copy Error &amp; Missing Git CLI Tooling:</w:t>
-      </w:r>
-      <w:r>
-        <w:rPr>
-          <w:sz w:val="24"/>
-          <w:szCs w:val="24"/>
-        </w:rPr>
-        <w:t xml:space="preserve"> Copying the Secret ID instead of the Secret Value, alongside environment misconfigurations that were resolved upon installing Git CLI.</w:t>
+        <w:t xml:space="preserve">Credential Copy Error &amp; Missing </w:t>
+      </w:r>
+      <w:proofErr w:type="spellStart"/>
+      <w:r>
+        <w:rPr>
+          <w:b/>
+          <w:bCs/>
+          <w:sz w:val="24"/>
+          <w:szCs w:val="24"/>
+        </w:rPr>
+        <w:t>Git</w:t>
+      </w:r>
+      <w:proofErr w:type="spellEnd"/>
+      <w:r>
+        <w:rPr>
+          <w:b/>
+          <w:bCs/>
+          <w:sz w:val="24"/>
+          <w:szCs w:val="24"/>
+        </w:rPr>
+        <w:t xml:space="preserve"> CLI Tooling:</w:t>
+      </w:r>
+      <w:r>
+        <w:rPr>
+          <w:sz w:val="24"/>
+          <w:szCs w:val="24"/>
+        </w:rPr>
+        <w:t xml:space="preserve"> Copying the Secret ID instead of the Secret Value, alongside environment misconfigurations that were resolved upon installing </w:t>
+      </w:r>
+      <w:proofErr w:type="spellStart"/>
+      <w:r>
+        <w:rPr>
+          <w:sz w:val="24"/>
+          <w:szCs w:val="24"/>
+        </w:rPr>
+        <w:t>Git</w:t>
+      </w:r>
+      <w:proofErr w:type="spellEnd"/>
+      <w:r>
+        <w:rPr>
+          <w:sz w:val="24"/>
+          <w:szCs w:val="24"/>
+        </w:rPr>
+        <w:t xml:space="preserve"> CLI.</w:t>
       </w:r>
     </w:p>
     <w:p>
@@ -631,14 +886,52 @@
           <w:sz w:val="24"/>
           <w:szCs w:val="24"/>
         </w:rPr>
-        <w:t>Script Idempotency Defect:</w:t>
-      </w:r>
-      <w:r>
-        <w:rPr>
-          <w:sz w:val="24"/>
-          <w:szCs w:val="24"/>
-        </w:rPr>
-        <w:t xml:space="preserve"> The original deploy.sh lacked safety checks for existing Azure AD group memberships. Re-running the pipeline caused az ad group member add to throw a hard error on duplicate additions, halting execution under set -e.</w:t>
+        <w:t xml:space="preserve">Script </w:t>
+      </w:r>
+      <w:proofErr w:type="spellStart"/>
+      <w:r>
+        <w:rPr>
+          <w:b/>
+          <w:bCs/>
+          <w:sz w:val="24"/>
+          <w:szCs w:val="24"/>
+        </w:rPr>
+        <w:t>Idempotency</w:t>
+      </w:r>
+      <w:proofErr w:type="spellEnd"/>
+      <w:r>
+        <w:rPr>
+          <w:b/>
+          <w:bCs/>
+          <w:sz w:val="24"/>
+          <w:szCs w:val="24"/>
+        </w:rPr>
+        <w:t xml:space="preserve"> Defect:</w:t>
+      </w:r>
+      <w:r>
+        <w:rPr>
+          <w:sz w:val="24"/>
+          <w:szCs w:val="24"/>
+        </w:rPr>
+        <w:t xml:space="preserve"> The original deploy.sh lacked safety checks for existing Azure AD group memberships. Re-running the pipeline caused </w:t>
+      </w:r>
+      <w:proofErr w:type="spellStart"/>
+      <w:proofErr w:type="gramStart"/>
+      <w:r>
+        <w:rPr>
+          <w:sz w:val="24"/>
+          <w:szCs w:val="24"/>
+        </w:rPr>
+        <w:t>az</w:t>
+      </w:r>
+      <w:proofErr w:type="spellEnd"/>
+      <w:proofErr w:type="gramEnd"/>
+      <w:r>
+        <w:rPr>
+          <w:sz w:val="24"/>
+          <w:szCs w:val="24"/>
+        </w:rPr>
+        <w:t xml:space="preserve"> ad group member add to throw a hard error on duplicate additions, halting execution under set -e.</w:t>
       </w:r>
     </w:p>
     <w:p>
@@ -731,14 +1024,50 @@
           <w:sz w:val="24"/>
           <w:szCs w:val="24"/>
         </w:rPr>
-        <w:t>Credential &amp; Git CLI Correction:</w:t>
-      </w:r>
-      <w:r>
-        <w:rPr>
-          <w:sz w:val="24"/>
-          <w:szCs w:val="24"/>
-        </w:rPr>
-        <w:t xml:space="preserve"> Installed Git CLI, regenerated the client secret in the Azure Portal, copied directly from the Value column, and properly configured the AZURE_CREDENTIALS secret in GitHub Repository Secrets.</w:t>
+        <w:t xml:space="preserve">Credential &amp; </w:t>
+      </w:r>
+      <w:proofErr w:type="spellStart"/>
+      <w:r>
+        <w:rPr>
+          <w:b/>
+          <w:bCs/>
+          <w:sz w:val="24"/>
+          <w:szCs w:val="24"/>
+        </w:rPr>
+        <w:t>Git</w:t>
+      </w:r>
+      <w:proofErr w:type="spellEnd"/>
+      <w:r>
+        <w:rPr>
+          <w:b/>
+          <w:bCs/>
+          <w:sz w:val="24"/>
+          <w:szCs w:val="24"/>
+        </w:rPr>
+        <w:t xml:space="preserve"> CLI Correction:</w:t>
+      </w:r>
+      <w:r>
+        <w:rPr>
+          <w:sz w:val="24"/>
+          <w:szCs w:val="24"/>
+        </w:rPr>
+        <w:t xml:space="preserve"> Installed </w:t>
+      </w:r>
+      <w:proofErr w:type="spellStart"/>
+      <w:r>
+        <w:rPr>
+          <w:sz w:val="24"/>
+          <w:szCs w:val="24"/>
+        </w:rPr>
+        <w:t>Git</w:t>
+      </w:r>
+      <w:proofErr w:type="spellEnd"/>
+      <w:r>
+        <w:rPr>
+          <w:sz w:val="24"/>
+          <w:szCs w:val="24"/>
+        </w:rPr>
+        <w:t xml:space="preserve"> CLI, regenerated the client secret in the Azure Portal, copied directly from the Value column, and properly configured the AZURE_CREDENTIALS secret in GitHub Repository Secrets.</w:t>
       </w:r>
     </w:p>
     <w:p>
@@ -829,7 +1158,23 @@
         <w:t>Outcome:</w:t>
       </w:r>
       <w:r>
-        <w:t xml:space="preserve"> Re-running the GitHub Actions workflow (.github/workflows/deploy.yml) resulted in a </w:t>
+        <w:t xml:space="preserve"> Re-running the GitHub Actions workflow (.</w:t>
+      </w:r>
+      <w:proofErr w:type="spellStart"/>
+      <w:r>
+        <w:t>github</w:t>
+      </w:r>
+      <w:proofErr w:type="spellEnd"/>
+      <w:r>
+        <w:t>/workflows/</w:t>
+      </w:r>
+      <w:proofErr w:type="spellStart"/>
+      <w:r>
+        <w:t>deploy.yml</w:t>
+      </w:r>
+      <w:proofErr w:type="spellEnd"/>
+      <w:r>
+        <w:t xml:space="preserve">) resulted in a </w:t>
       </w:r>
       <w:r>
         <w:rPr>
@@ -844,22 +1189,84 @@
     </w:p>
     <w:p>
       <w:pPr>
-        <w:rPr>
-          <w:sz w:val="24"/>
-          <w:szCs w:val="24"/>
-        </w:rPr>
-      </w:pPr>
+        <w:pStyle w:val="NormalWeb"/>
+        <w:rPr>
+          <w:b/>
+          <w:color w:val="000000" w:themeColor="text1"/>
+        </w:rPr>
+      </w:pPr>
+      <w:r>
+        <w:rPr>
+          <w:b/>
+          <w:color w:val="000000" w:themeColor="text1"/>
+        </w:rPr>
+        <w:t>Design reflection</w:t>
+      </w:r>
+      <w:r>
+        <w:rPr>
+          <w:b/>
+          <w:color w:val="000000" w:themeColor="text1"/>
+        </w:rPr>
+        <w:t xml:space="preserve"> </w:t>
+      </w:r>
     </w:p>
     <w:p>
       <w:pPr>
-        <w:spacing w:after="150"/>
-        <w:rPr>
-          <w:sz w:val="24"/>
-          <w:szCs w:val="24"/>
-        </w:rPr>
-      </w:pPr>
+        <w:pStyle w:val="NormalWeb"/>
+      </w:pPr>
+      <w:r>
+        <w:rPr>
+          <w:color w:val="000000" w:themeColor="text1"/>
+        </w:rPr>
+        <w:t>The Phase 0 role matrix focused heavily on end-user scopes (interns and admins) but didn’t explicitly account for the automation identity itself. Consequently, the GitHub Actions service principal required User Access Administrator rights just to write rol</w:t>
+      </w:r>
+      <w:r>
+        <w:rPr>
+          <w:color w:val="000000" w:themeColor="text1"/>
+        </w:rPr>
+        <w:t xml:space="preserve">e assignments during deployment, </w:t>
+      </w:r>
       <w:bookmarkStart w:id="0" w:name="_GoBack"/>
       <w:bookmarkEnd w:id="0"/>
+      <w:r>
+        <w:rPr>
+          <w:color w:val="000000" w:themeColor="text1"/>
+        </w:rPr>
+        <w:t>a broader privilege footprint than anything in the original matrix. Going forward, I would explicitly scope the service principal’s initial grant to a dedicated management scope or document it as its own distinct row in the role matrix so it is fully visible to an auditor rather than only surfacing during pipeline troubleshooting.</w:t>
+      </w:r>
+    </w:p>
+    <w:p>
+      <w:pPr>
+        <w:pStyle w:val="ListParagraph"/>
+        <w:ind w:left="2160"/>
+        <w:rPr>
+          <w:color w:val="000000" w:themeColor="text1"/>
+          <w:sz w:val="24"/>
+          <w:szCs w:val="24"/>
+        </w:rPr>
+      </w:pPr>
+    </w:p>
+    <w:p>
+      <w:pPr>
+        <w:pStyle w:val="NormalWeb"/>
+      </w:pPr>
+    </w:p>
+    <w:p>
+      <w:pPr>
+        <w:rPr>
+          <w:sz w:val="24"/>
+          <w:szCs w:val="24"/>
+        </w:rPr>
+      </w:pPr>
+    </w:p>
+    <w:p>
+      <w:pPr>
+        <w:spacing w:after="150"/>
+        <w:rPr>
+          <w:sz w:val="24"/>
+          <w:szCs w:val="24"/>
+        </w:rPr>
+      </w:pPr>
     </w:p>
     <w:sectPr>
       <w:pgSz w:w="12240" w:h="15840"/>
@@ -3436,6 +3843,7 @@
   </w:style>
   <w:style w:type="paragraph" w:styleId="ListParagraph">
     <w:name w:val="List Paragraph"/>
+    <w:uiPriority w:val="34"/>
     <w:qFormat/>
   </w:style>
   <w:style w:type="character" w:styleId="Hyperlink">
@@ -3505,7 +3913,6 @@
     <w:name w:val="Normal (Web)"/>
     <w:basedOn w:val="Normal"/>
     <w:uiPriority w:val="99"/>
-    <w:semiHidden/>
     <w:unhideWhenUsed/>
     <w:rsid w:val="00056F2A"/>
     <w:pPr>

</xml_diff>